<commit_message>
Update vendor validation meeting brief
Co-Authored-By: Claude Sonnet 5 <noreply@anthropic.com>
</commit_message>
<xml_diff>
--- a/DW_HS_OCI_A10.2_Vendor_Validation_Meeting_Brief.docx
+++ b/DW_HS_OCI_A10.2_Vendor_Validation_Meeting_Brief.docx
@@ -243,7 +243,34 @@
         <w:spacing w:after="160"/>
       </w:pPr>
       <w:r>
-        <w:t>Leave the meeting with written vendor positions and named owners for every item that could change the OCI build: deployment model, worker-node operating system, Kubernetes/version matrix, GPU use, storage, database, networking, security, sizing, licensing, high availability, and proof-of-concept acceptance criteria.</w:t>
+        <w:rPr>
+          <w:rFonts w:ascii="Calibri" w:hAnsi="Calibri"/>
+          <w:b w:val="0"/>
+          <w:i w:val="0"/>
+          <w:color w:val="111111"/>
+          <w:sz w:val="22"/>
+        </w:rPr>
+        <w:t xml:space="preserve">Leave the meeting with </w:t>
+      </w:r>
+      <w:r>
+        <w:rPr>
+          <w:rFonts w:ascii="Calibri" w:hAnsi="Calibri"/>
+          <w:b/>
+          <w:i w:val="0"/>
+          <w:color w:val="111111"/>
+          <w:sz w:val="22"/>
+        </w:rPr>
+        <w:t>written vendor positions and named owners</w:t>
+      </w:r>
+      <w:r>
+        <w:rPr>
+          <w:rFonts w:ascii="Calibri" w:hAnsi="Calibri"/>
+          <w:b w:val="0"/>
+          <w:i w:val="0"/>
+          <w:color w:val="111111"/>
+          <w:sz w:val="22"/>
+        </w:rPr>
+        <w:t xml:space="preserve"> for every item that could change the OCI build: deployment model, worker-node operating system, Kubernetes/version matrix, GPU use, storage, database, networking, security, sizing, licensing, high availability, and proof-of-concept acceptance criteria.</w:t>
       </w:r>
     </w:p>
     <w:tbl>
@@ -665,7 +692,67 @@
           <w:color w:val="111111"/>
           <w:sz w:val="22"/>
         </w:rPr>
-        <w:t xml:space="preserve"> We selected OCI VM.GPU.A10.2—not A10.1—as the target GPU shape. Oracle documents A10.2 as an OKE GPU node-pool example. Our proposed landing zone is private Kubernetes with separate CPU platform capacity and isolated application/GPU capacity, plus external database, storage, registry, secrets, logging, and monitoring services. Today we need vendor confirmation that the exact OS, Kubernetes version, drivers, storage interfaces, security settings, and topology are supported before we approve a production build.</w:t>
+        <w:t xml:space="preserve"> We selected </w:t>
+      </w:r>
+      <w:r>
+        <w:rPr>
+          <w:rFonts w:ascii="Calibri" w:hAnsi="Calibri"/>
+          <w:b/>
+          <w:i w:val="0"/>
+          <w:color w:val="111111"/>
+          <w:sz w:val="22"/>
+        </w:rPr>
+        <w:t>OCI VM.GPU.A10.2—not A10.1</w:t>
+      </w:r>
+      <w:r>
+        <w:rPr>
+          <w:rFonts w:ascii="Calibri" w:hAnsi="Calibri"/>
+          <w:b w:val="0"/>
+          <w:i w:val="0"/>
+          <w:color w:val="111111"/>
+          <w:sz w:val="22"/>
+        </w:rPr>
+        <w:t xml:space="preserve">—as the target GPU shape. </w:t>
+      </w:r>
+      <w:r>
+        <w:rPr>
+          <w:rFonts w:ascii="Calibri" w:hAnsi="Calibri"/>
+          <w:b/>
+          <w:i w:val="0"/>
+          <w:color w:val="111111"/>
+          <w:sz w:val="22"/>
+        </w:rPr>
+        <w:t>Oracle documents A10.2 as an OKE GPU node-pool example.</w:t>
+      </w:r>
+      <w:r>
+        <w:rPr>
+          <w:rFonts w:ascii="Calibri" w:hAnsi="Calibri"/>
+          <w:b w:val="0"/>
+          <w:i w:val="0"/>
+          <w:color w:val="111111"/>
+          <w:sz w:val="22"/>
+        </w:rPr>
+        <w:t xml:space="preserve"> Our proposed landing zone is private Kubernetes with separate CPU platform capacity and isolated application/GPU capacity, plus external database, storage, registry, secrets, logging, and monitoring services. </w:t>
+      </w:r>
+      <w:r>
+        <w:rPr>
+          <w:rFonts w:ascii="Calibri" w:hAnsi="Calibri"/>
+          <w:b/>
+          <w:i w:val="0"/>
+          <w:color w:val="111111"/>
+          <w:sz w:val="22"/>
+        </w:rPr>
+        <w:t>Today we need written vendor confirmation</w:t>
+      </w:r>
+      <w:r>
+        <w:rPr>
+          <w:rFonts w:ascii="Calibri" w:hAnsi="Calibri"/>
+          <w:b w:val="0"/>
+          <w:i w:val="0"/>
+          <w:color w:val="111111"/>
+          <w:sz w:val="22"/>
+        </w:rPr>
+        <w:t xml:space="preserve"> that the exact OS, Kubernetes version, drivers, storage interfaces, security settings, and topology are supported before we approve a production build.</w:t>
       </w:r>
     </w:p>
     <w:p>
@@ -687,12 +774,22 @@
       <w:r>
         <w:rPr>
           <w:rFonts w:ascii="Calibri" w:hAnsi="Calibri"/>
+          <w:b/>
+          <w:i w:val="0"/>
+          <w:color w:val="111111"/>
+          <w:sz w:val="22"/>
+        </w:rPr>
+        <w:t>OCI VM.GPU.A10.2</w:t>
+      </w:r>
+      <w:r>
+        <w:rPr>
+          <w:rFonts w:ascii="Calibri" w:hAnsi="Calibri"/>
           <w:b w:val="0"/>
           <w:i w:val="0"/>
           <w:color w:val="111111"/>
           <w:sz w:val="22"/>
         </w:rPr>
-        <w:t>OCI VM.GPU.A10.2 provides 2 NVIDIA A10 GPUs, 30 OCPUs, 480 GB system memory, 48 GB total GPU memory across two discrete 24 GB devices, and up to 48 Gbps networking.</w:t>
+        <w:t xml:space="preserve"> provides 2 NVIDIA A10 GPUs, 30 OCPUs, 480 GB system memory, 48 GB total GPU memory across two discrete 24 GB devices, and up to 48 Gbps networking.</w:t>
       </w:r>
     </w:p>
     <w:p>
@@ -706,12 +803,22 @@
       <w:r>
         <w:rPr>
           <w:rFonts w:ascii="Calibri" w:hAnsi="Calibri"/>
+          <w:b/>
+          <w:i w:val="0"/>
+          <w:color w:val="111111"/>
+          <w:sz w:val="22"/>
+        </w:rPr>
+        <w:t>Oracle documents deploying an OKE node pool</w:t>
+      </w:r>
+      <w:r>
+        <w:rPr>
+          <w:rFonts w:ascii="Calibri" w:hAnsi="Calibri"/>
           <w:b w:val="0"/>
           <w:i w:val="0"/>
           <w:color w:val="111111"/>
           <w:sz w:val="22"/>
         </w:rPr>
-        <w:t>Oracle documents deploying an OKE node pool with VM.GPU.A10.2 and an OKE Oracle Linux GPU image or compatible custom image, with GPUs advertised to Kubernetes as resources such as nvidia.com/gpu.</w:t>
+        <w:t xml:space="preserve"> with VM.GPU.A10.2 and an OKE Oracle Linux GPU image or compatible custom image, with GPUs advertised to Kubernetes as resources such as nvidia.com/gpu.</w:t>
       </w:r>
     </w:p>
     <w:p>
@@ -725,12 +832,22 @@
       <w:r>
         <w:rPr>
           <w:rFonts w:ascii="Calibri" w:hAnsi="Calibri"/>
+          <w:b/>
+          <w:i w:val="0"/>
+          <w:color w:val="111111"/>
+          <w:sz w:val="22"/>
+        </w:rPr>
+        <w:t>DataWalk 5.1</w:t>
+      </w:r>
+      <w:r>
+        <w:rPr>
+          <w:rFonts w:ascii="Calibri" w:hAnsi="Calibri"/>
           <w:b w:val="0"/>
           <w:i w:val="0"/>
           <w:color w:val="111111"/>
           <w:sz w:val="22"/>
         </w:rPr>
-        <w:t>DataWalk 5.1 supports container and non-container deployments; 5.2+ requires containers and Decoupled Storage. DataWalk's public preparation page names RHEL 8.10 or Rocky Linux 8 and calls for Kubernetes/container-trained administrators.</w:t>
+        <w:t xml:space="preserve"> supports container and non-container deployments; 5.2+ requires containers and Decoupled Storage. DataWalk's public preparation page names RHEL 8.10 or Rocky Linux 8 and calls for Kubernetes/container-trained administrators.</w:t>
       </w:r>
     </w:p>
     <w:p>
@@ -744,12 +861,22 @@
       <w:r>
         <w:rPr>
           <w:rFonts w:ascii="Calibri" w:hAnsi="Calibri"/>
+          <w:b/>
+          <w:i w:val="0"/>
+          <w:color w:val="111111"/>
+          <w:sz w:val="22"/>
+        </w:rPr>
+        <w:t>Hyperscience installs on an existing Kubernetes cluster</w:t>
+      </w:r>
+      <w:r>
+        <w:rPr>
+          <w:rFonts w:ascii="Calibri" w:hAnsi="Calibri"/>
           <w:b w:val="0"/>
           <w:i w:val="0"/>
           <w:color w:val="111111"/>
           <w:sz w:val="22"/>
         </w:rPr>
-        <w:t>Hyperscience installs on an existing Kubernetes cluster, recommends a dedicated namespace, requires external SQL database and file storage, and calls for separate platform and trainer node groups.</w:t>
+        <w:t>, recommends a dedicated namespace, requires external SQL database and file storage, and calls for separate platform and trainer node groups.</w:t>
       </w:r>
     </w:p>
     <w:p>
@@ -763,12 +890,22 @@
       <w:r>
         <w:rPr>
           <w:rFonts w:ascii="Calibri" w:hAnsi="Calibri"/>
+          <w:b/>
+          <w:i w:val="0"/>
+          <w:color w:val="111111"/>
+          <w:sz w:val="22"/>
+        </w:rPr>
+        <w:t>Hyperscience supports GPU trainers in v41+</w:t>
+      </w:r>
+      <w:r>
+        <w:rPr>
+          <w:rFonts w:ascii="Calibri" w:hAnsi="Calibri"/>
           <w:b w:val="0"/>
           <w:i w:val="0"/>
           <w:color w:val="111111"/>
           <w:sz w:val="22"/>
         </w:rPr>
-        <w:t>Hyperscience supports GPU trainers in v41+ and publicly lists NVIDIA A10 (24 GB, compute capability 8.6) for specified 42.x+ versions and ORCA use cases.</w:t>
+        <w:t xml:space="preserve"> and publicly lists NVIDIA A10 (24 GB, compute capability 8.6) for specified 42.x+ versions and ORCA use cases.</w:t>
       </w:r>
     </w:p>
     <w:p>
@@ -782,12 +919,22 @@
       <w:r>
         <w:rPr>
           <w:rFonts w:ascii="Calibri" w:hAnsi="Calibri"/>
+          <w:b/>
+          <w:i w:val="0"/>
+          <w:color w:val="111111"/>
+          <w:sz w:val="22"/>
+        </w:rPr>
+        <w:t>Kubernetes 1.34 is supported through December 2026 and 1.35 through April 2027</w:t>
+      </w:r>
+      <w:r>
+        <w:rPr>
+          <w:rFonts w:ascii="Calibri" w:hAnsi="Calibri"/>
           <w:b w:val="0"/>
           <w:i w:val="0"/>
           <w:color w:val="111111"/>
           <w:sz w:val="22"/>
         </w:rPr>
-        <w:t>As of the current Hyperscience page, Kubernetes 1.34 is supported through December 2026 and 1.35 through April 2027; the exact application release still must be matched to that calendar.</w:t>
+        <w:t xml:space="preserve"> according to the current Hyperscience page; the exact application release still must be matched to that calendar.</w:t>
       </w:r>
     </w:p>
     <w:p>
@@ -809,12 +956,22 @@
       <w:r>
         <w:rPr>
           <w:rFonts w:ascii="Calibri" w:hAnsi="Calibri"/>
+          <w:b/>
+          <w:i w:val="0"/>
+          <w:color w:val="111111"/>
+          <w:sz w:val="22"/>
+        </w:rPr>
+        <w:t>Do not say RHEL 8.10 is the managed OKE worker image.</w:t>
+      </w:r>
+      <w:r>
+        <w:rPr>
+          <w:rFonts w:ascii="Calibri" w:hAnsi="Calibri"/>
           <w:b w:val="0"/>
           <w:i w:val="0"/>
           <w:color w:val="111111"/>
           <w:sz w:val="22"/>
         </w:rPr>
-        <w:t>Do not say RHEL 8.10 is the managed OKE worker image. Oracle's supported managed-node path uses approved OKE images; vendor acceptance of Oracle Linux must be obtained.</w:t>
+        <w:t xml:space="preserve"> Oracle's supported managed-node path uses approved OKE images; vendor acceptance of Oracle Linux must be obtained.</w:t>
       </w:r>
     </w:p>
     <w:p>
@@ -828,12 +985,22 @@
       <w:r>
         <w:rPr>
           <w:rFonts w:ascii="Calibri" w:hAnsi="Calibri"/>
+          <w:b/>
+          <w:i w:val="0"/>
+          <w:color w:val="111111"/>
+          <w:sz w:val="22"/>
+        </w:rPr>
+        <w:t>Do not say two 24 GB A10 GPUs behave as one 48 GB GPU.</w:t>
+      </w:r>
+      <w:r>
+        <w:rPr>
+          <w:rFonts w:ascii="Calibri" w:hAnsi="Calibri"/>
           <w:b w:val="0"/>
           <w:i w:val="0"/>
           <w:color w:val="111111"/>
           <w:sz w:val="22"/>
         </w:rPr>
-        <w:t>Do not say two 24 GB A10 GPUs behave as one 48 GB GPU. Multi-GPU execution and memory behavior are application-dependent.</w:t>
+        <w:t xml:space="preserve"> Multi-GPU execution and memory behavior are application-dependent.</w:t>
       </w:r>
     </w:p>
     <w:p>
@@ -847,12 +1014,22 @@
       <w:r>
         <w:rPr>
           <w:rFonts w:ascii="Calibri" w:hAnsi="Calibri"/>
+          <w:b/>
+          <w:i w:val="0"/>
+          <w:color w:val="111111"/>
+          <w:sz w:val="22"/>
+        </w:rPr>
+        <w:t>Do not claim DataWalk receives GPU acceleration</w:t>
+      </w:r>
+      <w:r>
+        <w:rPr>
+          <w:rFonts w:ascii="Calibri" w:hAnsi="Calibri"/>
           <w:b w:val="0"/>
           <w:i w:val="0"/>
           <w:color w:val="111111"/>
           <w:sz w:val="22"/>
         </w:rPr>
-        <w:t>Do not claim DataWalk receives GPU acceleration until DataWalk identifies the component, container image, CUDA/driver requirements, and supported resource request.</w:t>
+        <w:t xml:space="preserve"> until DataWalk identifies the component, container image, CUDA/driver requirements, and supported resource request.</w:t>
       </w:r>
     </w:p>
     <w:p>
@@ -866,12 +1043,22 @@
       <w:r>
         <w:rPr>
           <w:rFonts w:ascii="Calibri" w:hAnsi="Calibri"/>
+          <w:b/>
+          <w:i w:val="0"/>
+          <w:color w:val="111111"/>
+          <w:sz w:val="22"/>
+        </w:rPr>
+        <w:t>Do not assume OCI services are certified</w:t>
+      </w:r>
+      <w:r>
+        <w:rPr>
+          <w:rFonts w:ascii="Calibri" w:hAnsi="Calibri"/>
           <w:b w:val="0"/>
           <w:i w:val="0"/>
           <w:color w:val="111111"/>
           <w:sz w:val="22"/>
         </w:rPr>
-        <w:t>Do not assume OCI Object Storage, OCI Container Registry, OCI Load Balancer, or an OCI database is certified merely because the interfaces appear compatible.</w:t>
+        <w:t xml:space="preserve"> merely because OCI Object Storage, OCI Container Registry, OCI Load Balancer, or an OCI database exposes a compatible-looking interface.</w:t>
       </w:r>
     </w:p>
     <w:p>
@@ -885,12 +1072,22 @@
       <w:r>
         <w:rPr>
           <w:rFonts w:ascii="Calibri" w:hAnsi="Calibri"/>
+          <w:b/>
+          <w:i w:val="0"/>
+          <w:color w:val="111111"/>
+          <w:sz w:val="22"/>
+        </w:rPr>
+        <w:t>Do not assume a single shared cluster is acceptable</w:t>
+      </w:r>
+      <w:r>
+        <w:rPr>
+          <w:rFonts w:ascii="Calibri" w:hAnsi="Calibri"/>
           <w:b w:val="0"/>
           <w:i w:val="0"/>
           <w:color w:val="111111"/>
           <w:sz w:val="22"/>
         </w:rPr>
-        <w:t>Do not assume a single shared cluster is acceptable for production support, security authorization, upgrades, or failure isolation.</w:t>
+        <w:t xml:space="preserve"> for production support, security authorization, upgrades, or failure isolation.</w:t>
       </w:r>
     </w:p>
     <w:tbl>
@@ -2024,12 +2221,22 @@
       <w:r>
         <w:rPr>
           <w:rFonts w:ascii="Calibri" w:hAnsi="Calibri"/>
+          <w:b/>
+          <w:i w:val="0"/>
+          <w:color w:val="111111"/>
+          <w:sz w:val="22"/>
+        </w:rPr>
+        <w:t>Platform:</w:t>
+      </w:r>
+      <w:r>
+        <w:rPr>
+          <w:rFonts w:ascii="Calibri" w:hAnsi="Calibri"/>
           <w:b w:val="0"/>
           <w:i w:val="0"/>
           <w:color w:val="111111"/>
           <w:sz w:val="22"/>
         </w:rPr>
-        <w:t>Platform: A10.2 is available in the target availability domain; each node reports two healthy NVIDIA A10 devices; Kubernetes advertises the expected GPU resources.</w:t>
+        <w:t xml:space="preserve"> A10.2 is available in the target availability domain; each node reports two healthy NVIDIA A10 devices; Kubernetes advertises the expected GPU resources.</w:t>
       </w:r>
     </w:p>
     <w:p>
@@ -2043,12 +2250,22 @@
       <w:r>
         <w:rPr>
           <w:rFonts w:ascii="Calibri" w:hAnsi="Calibri"/>
+          <w:b/>
+          <w:i w:val="0"/>
+          <w:color w:val="111111"/>
+          <w:sz w:val="22"/>
+        </w:rPr>
+        <w:t>Compatibility:</w:t>
+      </w:r>
+      <w:r>
+        <w:rPr>
+          <w:rFonts w:ascii="Calibri" w:hAnsi="Calibri"/>
           <w:b w:val="0"/>
           <w:i w:val="0"/>
           <w:color w:val="111111"/>
           <w:sz w:val="22"/>
         </w:rPr>
-        <w:t>Compatibility: signed matrix records application, chart, Kubernetes, node OS/image, kernel, container runtime, driver, CUDA, database, storage, ingress, and registry versions.</w:t>
+        <w:t xml:space="preserve"> signed matrix records application, chart, Kubernetes, node OS/image, kernel, container runtime, driver, CUDA, database, storage, ingress, and registry versions.</w:t>
       </w:r>
     </w:p>
     <w:p>
@@ -2062,12 +2279,22 @@
       <w:r>
         <w:rPr>
           <w:rFonts w:ascii="Calibri" w:hAnsi="Calibri"/>
+          <w:b/>
+          <w:i w:val="0"/>
+          <w:color w:val="111111"/>
+          <w:sz w:val="22"/>
+        </w:rPr>
+        <w:t>Functionality:</w:t>
+      </w:r>
+      <w:r>
+        <w:rPr>
+          <w:rFonts w:ascii="Calibri" w:hAnsi="Calibri"/>
           <w:b w:val="0"/>
           <w:i w:val="0"/>
           <w:color w:val="111111"/>
           <w:sz w:val="22"/>
         </w:rPr>
-        <w:t>Functionality: representative DataWalk ingestion/graph workloads and Hyperscience training/inference workflows complete successfully.</w:t>
+        <w:t xml:space="preserve"> representative DataWalk ingestion/graph workloads and Hyperscience training/inference workflows complete successfully.</w:t>
       </w:r>
     </w:p>
     <w:p>
@@ -2081,12 +2308,22 @@
       <w:r>
         <w:rPr>
           <w:rFonts w:ascii="Calibri" w:hAnsi="Calibri"/>
+          <w:b/>
+          <w:i w:val="0"/>
+          <w:color w:val="111111"/>
+          <w:sz w:val="22"/>
+        </w:rPr>
+        <w:t>Performance:</w:t>
+      </w:r>
+      <w:r>
+        <w:rPr>
+          <w:rFonts w:ascii="Calibri" w:hAnsi="Calibri"/>
           <w:b w:val="0"/>
           <w:i w:val="0"/>
           <w:color w:val="111111"/>
           <w:sz w:val="22"/>
         </w:rPr>
-        <w:t>Performance: agreed throughput, latency, concurrency, accuracy, CPU/RAM, GPU memory/utilization, storage latency, and network targets are met.</w:t>
+        <w:t xml:space="preserve"> agreed throughput, latency, concurrency, accuracy, CPU/RAM, GPU memory/utilization, storage latency, and network targets are met.</w:t>
       </w:r>
     </w:p>
     <w:p>
@@ -2100,12 +2337,22 @@
       <w:r>
         <w:rPr>
           <w:rFonts w:ascii="Calibri" w:hAnsi="Calibri"/>
+          <w:b/>
+          <w:i w:val="0"/>
+          <w:color w:val="111111"/>
+          <w:sz w:val="22"/>
+        </w:rPr>
+        <w:t>Resilience:</w:t>
+      </w:r>
+      <w:r>
+        <w:rPr>
+          <w:rFonts w:ascii="Calibri" w:hAnsi="Calibri"/>
           <w:b w:val="0"/>
           <w:i w:val="0"/>
           <w:color w:val="111111"/>
           <w:sz w:val="22"/>
         </w:rPr>
-        <w:t>Resilience: node drain, pod restart, node loss, backup, restore, and application recovery meet agreed RPO/RTO targets.</w:t>
+        <w:t xml:space="preserve"> node drain, pod restart, node loss, backup, restore, and application recovery meet agreed RPO/RTO targets.</w:t>
       </w:r>
     </w:p>
     <w:p>
@@ -2119,12 +2366,22 @@
       <w:r>
         <w:rPr>
           <w:rFonts w:ascii="Calibri" w:hAnsi="Calibri"/>
+          <w:b/>
+          <w:i w:val="0"/>
+          <w:color w:val="111111"/>
+          <w:sz w:val="22"/>
+        </w:rPr>
+        <w:t>Security:</w:t>
+      </w:r>
+      <w:r>
+        <w:rPr>
+          <w:rFonts w:ascii="Calibri" w:hAnsi="Calibri"/>
           <w:b w:val="0"/>
           <w:i w:val="0"/>
           <w:color w:val="111111"/>
           <w:sz w:val="22"/>
         </w:rPr>
-        <w:t>Security: private endpoints, least privilege, vulnerability scanning, encryption, audit logging, egress controls, and required pod-security exceptions pass review.</w:t>
+        <w:t xml:space="preserve"> private endpoints, least privilege, vulnerability scanning, encryption, audit logging, egress controls, and required pod-security exceptions pass review.</w:t>
       </w:r>
     </w:p>
     <w:p>
@@ -2138,12 +2395,22 @@
       <w:r>
         <w:rPr>
           <w:rFonts w:ascii="Calibri" w:hAnsi="Calibri"/>
+          <w:b/>
+          <w:i w:val="0"/>
+          <w:color w:val="111111"/>
+          <w:sz w:val="22"/>
+        </w:rPr>
+        <w:t>Operations:</w:t>
+      </w:r>
+      <w:r>
+        <w:rPr>
+          <w:rFonts w:ascii="Calibri" w:hAnsi="Calibri"/>
           <w:b w:val="0"/>
           <w:i w:val="0"/>
           <w:color w:val="111111"/>
           <w:sz w:val="22"/>
         </w:rPr>
-        <w:t>Operations: monitoring, alerting, patching, upgrade, rollback, evidence retention, and vendor escalation procedures are demonstrated.</w:t>
+        <w:t xml:space="preserve"> monitoring, alerting, patching, upgrade, rollback, evidence retention, and vendor escalation procedures are demonstrated.</w:t>
       </w:r>
     </w:p>
     <w:p>
@@ -2289,7 +2556,7 @@
             <w:r>
               <w:rPr>
                 <w:rFonts w:ascii="Calibri" w:hAnsi="Calibri"/>
-                <w:b w:val="0"/>
+                <w:b/>
                 <w:i w:val="0"/>
                 <w:color w:val="111111"/>
                 <w:sz w:val="20"/>
@@ -2383,7 +2650,7 @@
             <w:r>
               <w:rPr>
                 <w:rFonts w:ascii="Calibri" w:hAnsi="Calibri"/>
-                <w:b w:val="0"/>
+                <w:b/>
                 <w:i w:val="0"/>
                 <w:color w:val="111111"/>
                 <w:sz w:val="20"/>
@@ -2477,7 +2744,7 @@
             <w:r>
               <w:rPr>
                 <w:rFonts w:ascii="Calibri" w:hAnsi="Calibri"/>
-                <w:b w:val="0"/>
+                <w:b/>
                 <w:i w:val="0"/>
                 <w:color w:val="111111"/>
                 <w:sz w:val="20"/>
@@ -2571,7 +2838,7 @@
             <w:r>
               <w:rPr>
                 <w:rFonts w:ascii="Calibri" w:hAnsi="Calibri"/>
-                <w:b w:val="0"/>
+                <w:b/>
                 <w:i w:val="0"/>
                 <w:color w:val="111111"/>
                 <w:sz w:val="20"/>
@@ -2665,7 +2932,7 @@
             <w:r>
               <w:rPr>
                 <w:rFonts w:ascii="Calibri" w:hAnsi="Calibri"/>
-                <w:b w:val="0"/>
+                <w:b/>
                 <w:i w:val="0"/>
                 <w:color w:val="111111"/>
                 <w:sz w:val="20"/>
@@ -2759,7 +3026,7 @@
             <w:r>
               <w:rPr>
                 <w:rFonts w:ascii="Calibri" w:hAnsi="Calibri"/>
-                <w:b w:val="0"/>
+                <w:b/>
                 <w:i w:val="0"/>
                 <w:color w:val="111111"/>
                 <w:sz w:val="20"/>
@@ -2853,7 +3120,7 @@
             <w:r>
               <w:rPr>
                 <w:rFonts w:ascii="Calibri" w:hAnsi="Calibri"/>
-                <w:b w:val="0"/>
+                <w:b/>
                 <w:i w:val="0"/>
                 <w:color w:val="111111"/>
                 <w:sz w:val="20"/>
@@ -2947,7 +3214,7 @@
             <w:r>
               <w:rPr>
                 <w:rFonts w:ascii="Calibri" w:hAnsi="Calibri"/>
-                <w:b w:val="0"/>
+                <w:b/>
                 <w:i w:val="0"/>
                 <w:color w:val="111111"/>
                 <w:sz w:val="20"/>
@@ -3041,7 +3308,7 @@
             <w:r>
               <w:rPr>
                 <w:rFonts w:ascii="Calibri" w:hAnsi="Calibri"/>
-                <w:b w:val="0"/>
+                <w:b/>
                 <w:i w:val="0"/>
                 <w:color w:val="111111"/>
                 <w:sz w:val="20"/>
@@ -3140,12 +3407,22 @@
       <w:r>
         <w:rPr>
           <w:rFonts w:ascii="Calibri" w:hAnsi="Calibri"/>
+          <w:b/>
+          <w:i w:val="0"/>
+          <w:color w:val="111111"/>
+          <w:sz w:val="22"/>
+        </w:rPr>
+        <w:t>Each vendor will provide written confirmation</w:t>
+      </w:r>
+      <w:r>
+        <w:rPr>
+          <w:rFonts w:ascii="Calibri" w:hAnsi="Calibri"/>
           <w:b w:val="0"/>
           <w:i w:val="0"/>
           <w:color w:val="111111"/>
           <w:sz w:val="22"/>
         </w:rPr>
-        <w:t>Each vendor will provide written confirmation—not only verbal guidance—for OS, Kubernetes, GPU, storage, and supportability decisions.</w:t>
+        <w:t>—not only verbal guidance—for OS, Kubernetes, GPU, storage, and supportability decisions.</w:t>
       </w:r>
     </w:p>
     <w:p>
@@ -3159,12 +3436,22 @@
       <w:r>
         <w:rPr>
           <w:rFonts w:ascii="Calibri" w:hAnsi="Calibri"/>
+          <w:b/>
+          <w:i w:val="0"/>
+          <w:color w:val="111111"/>
+          <w:sz w:val="22"/>
+        </w:rPr>
+        <w:t>One owner and due date</w:t>
+      </w:r>
+      <w:r>
+        <w:rPr>
+          <w:rFonts w:ascii="Calibri" w:hAnsi="Calibri"/>
           <w:b w:val="0"/>
           <w:i w:val="0"/>
           <w:color w:val="111111"/>
           <w:sz w:val="22"/>
         </w:rPr>
-        <w:t>One owner and due date will be assigned to every open item.</w:t>
+        <w:t xml:space="preserve"> will be assigned to every open item.</w:t>
       </w:r>
     </w:p>
     <w:p>
@@ -3178,12 +3465,22 @@
       <w:r>
         <w:rPr>
           <w:rFonts w:ascii="Calibri" w:hAnsi="Calibri"/>
+          <w:b/>
+          <w:i w:val="0"/>
+          <w:color w:val="111111"/>
+          <w:sz w:val="22"/>
+        </w:rPr>
+        <w:t>No production build will start</w:t>
+      </w:r>
+      <w:r>
+        <w:rPr>
+          <w:rFonts w:ascii="Calibri" w:hAnsi="Calibri"/>
           <w:b w:val="0"/>
           <w:i w:val="0"/>
           <w:color w:val="111111"/>
           <w:sz w:val="22"/>
         </w:rPr>
-        <w:t>No production build will start until the joint version matrix and POC gates are approved.</w:t>
+        <w:t xml:space="preserve"> until the joint version matrix and POC gates are approved.</w:t>
       </w:r>
     </w:p>
     <w:p>

</xml_diff>